<commit_message>
integrate task 3 with task 4 via set-schema endpoint
</commit_message>
<xml_diff>
--- a/backend/media/documents/brd_1.docx
+++ b/backend/media/documents/brd_1.docx
@@ -896,7 +896,7 @@
         <w:spacing w:after="120"/>
       </w:pPr>
       <w:r>
-        <w:t>Patient records are currently managed manually through paper files and disconnected spreadsheets across departments, resulting in a lack of transparency, data integrity, and efficient information sharing. The absence of a centralized patient record management system has contributed to delays in treatment planning, reduced clinical decision-making accuracy, and compromised patient care quality.</w:t>
+        <w:t>Patient records are currently managed manually through paper files and disconnected spreadsheets across departments, resulting in inefficient data retrieval and inadequate record sharing among healthcare professionals. The absence of a centralized patient record management system has led to a lack of transparency and accountability in patient care, necessitating the development of an electronic solution to streamline clinical operations.</w:t>
       </w:r>
     </w:p>
     <w:p>
@@ -931,7 +931,7 @@
         <w:spacing w:after="120"/>
       </w:pPr>
       <w:r>
-        <w:t>The absence of a unified digital system to manage patient data and streamline clinical workflows has contributed to the proliferation of fragmented manual processes, necessitating a fundamental transformation of the healthcare infrastructure. Growing patient volume and regulatory pressure require a comprehensive solution that integrates disparate systems and enables seamless information exchange. The lack of a centralized platform for managing patient records, scheduling appointments, and tracking treatment outcomes has resulted in inefficiencies, errors, and compromised patient care.</w:t>
+        <w:t>The absence of a unified digital system to streamline patient management and regulatory compliance has contributed to the proliferation of fragmented manual processes, necessitating a fundamental transformation of the healthcare infrastructure. Growing patient volume and regulatory pressure require a comprehensive solution to replace outdated procedures, ensuring seamless data exchange and real-time analytics for informed decision-making.</w:t>
       </w:r>
     </w:p>
     <w:p>
@@ -1047,7 +1047,7 @@
         <w:spacing w:after="120"/>
       </w:pPr>
       <w:r>
-        <w:t>The hospital's reliance on fragmented manual systems has resulted in inefficiencies in patient care delivery and administrative operations. The absence of a unified platform for managing patient data and workflows hinders the ability to provide timely and effective care, leading to suboptimal outcomes. Inefficient processes and lack of visibility into operational metrics impede the hospital's capacity to respond to changing demands and optimize resource allocation.</w:t>
+        <w:t>The hospital's reliance on fragmented manual systems has resulted in inefficiencies in patient care delivery and administrative operations. The absence of a unified platform for managing patient data and streamlining clinical workflows hinders the ability to provide timely and effective care, ultimately impacting patient outcomes. Inefficient administrative processes also impede the hospital's capacity to respond promptly to changing healthcare demands, compromising its overall performance.</w:t>
       </w:r>
     </w:p>
     <w:p>
@@ -1066,7 +1066,7 @@
         <w:spacing w:after="120"/>
       </w:pPr>
       <w:r>
-        <w:t>The proposed solution is an integrated Hospital Management System that comprehensively covers patient records, scheduling, billing, and staff management. The system shall provide a unified platform for healthcare professionals to efficiently manage patient data, streamline clinical workflows, and enhance overall operational efficiency. The system's architecture shall be designed to accommodate scalability, security, and reliability, ensuring seamless integration with existing hospital systems and infrastructure.</w:t>
+        <w:t>The proposed solution is an integrated Hospital Management System that comprehensively covers patient records, scheduling, billing, and staff management. The system shall integrate all relevant hospital functions into a single platform, ensuring seamless data exchange and streamlined operations. A high-priority requirement mandates the implementation of robust security measures to safeguard sensitive patient information and protect against unauthorized access. The system shall provide real-time reporting capabilities for administrators, enabling informed decision-making and effective resource allocation.</w:t>
       </w:r>
     </w:p>
     <w:p>
@@ -1085,7 +1085,7 @@
         <w:spacing w:after="120"/>
       </w:pPr>
       <w:r>
-        <w:t>The company shall operate as a regional hospital serving over 500 daily outpatients in the Eastern Province. The hospital's primary objective is to provide high-quality healthcare services to its patients. The hospital shall maintain a strong presence in the region, fostering trust and confidence among its patient base.</w:t>
+        <w:t>The company shall operate as a regional hospital serving over 500 daily outpatients in the Eastern Province. The hospital's primary objective is to provide high-quality medical care and services to its patients. The hospital's operations shall be conducted within a defined geographic area, specifically the Eastern Province.</w:t>
       </w:r>
     </w:p>
     <w:p>

</xml_diff>